<commit_message>
agregado el taller 9 y actualizacion del 10 para incluir modificaciones en ahoro de bateria
</commit_message>
<xml_diff>
--- a/docs/Taller10_Integracion_inicial.docx
+++ b/docs/Taller10_Integracion_inicial.docx
@@ -2840,7 +2840,7 @@
                 <w:sz w:val="19"/>
                 <w:szCs w:val="19"/>
               </w:rPr>
-              <w:t xml:space="preserve">Lee los contactos y el PIR, filtra rebotes (50 ms) y bloquea el PIR 8 s entre eventos. Se empareja con el concentrador y emite eventos y un estado cada 30 s. No habla con Internet.</w:t>
+              <w:t xml:space="preserve">Lee los contactos y el PIR, filtra rebotes (50 ms) y bloquea el PIR 8 s entre eventos. Se empareja con el concentrador y emite eventos y un latido cada 20 s (nodo PIR) o 60 s (nodo magnético). Pasa casi todo el tiempo dormido y solo despierta por un cambio del sensor o por el temporizador (sección 5.4). No habla con Internet.</w:t>
             </w:r>
           </w:p>
         </w:tc>
@@ -4711,7 +4711,7 @@
                 <w:sz w:val="19"/>
                 <w:szCs w:val="19"/>
               </w:rPr>
-              <w:t xml:space="preserve">Entradas: contactos MC-38 en GPIO 4 y 3 (pull-up, activo bajo) y PIR AM312 en GPIO 5. Salida: paquete ESP-NOW de 81 bytes. Busca el canal del concentrador (1 a 13) y guarda su MAC en memoria no volátil.</w:t>
+              <w:t xml:space="preserve">Entradas: contactos MC-38 en GPIO 4 y 3 (pull-up, activo bajo) y PIR AM312 en GPIO 5. Salida: paquete ESP-NOW de 81 bytes. Duerme entre eventos (suspensión ligera) y el PIR solo despierta al nodo si la casa está armada. Busca el canal del concentrador (1 a 13) y guarda su MAC en memoria no volátil.</w:t>
             </w:r>
           </w:p>
         </w:tc>
@@ -4883,7 +4883,7 @@
           <w:sz w:val="22"/>
           <w:szCs w:val="22"/>
         </w:rPr>
-        <w:t xml:space="preserve">El enlace del nodo al concentrador usa una estructura binaria de 81 bytes idéntica en ambos extremos: magia "SR" (2 bytes), versión (1), tipo (1: evento, estado, hola, emparejar, respuesta), secuencia (4), nodoId (16), sensorId (24), variable (16), zona (16) y valor (1 con signo). El enlace del concentrador al backend usa JSON:</w:t>
+        <w:t xml:space="preserve">El enlace del nodo al concentrador usa una estructura binaria de 81 bytes idéntica en ambos extremos: magia "SR" (2 bytes), versión (1), tipo (1: evento, estado, hola, emparejar, respuesta, 6: armado), secuencia (4), nodoId (16), sensorId (24), variable (16), zona (16) y valor (1 con signo). El enlace del concentrador al backend usa JSON:</w:t>
       </w:r>
     </w:p>
     <w:p>
@@ -5380,6 +5380,1106 @@
           <w:szCs w:val="22"/>
         </w:rPr>
         <w:t xml:space="preserve">Los tres programas se compilan en el IDE de Arduino con el soporte de placas ESP32 (el código admite el núcleo 3.x con ESP-IDF 5 y versiones anteriores) y la librería ArduinoJson 7. En este entorno de preparación no hay compilador de Arduino, por lo que la captura de compilación exitosa se toma en la computadora del proyecto (Anexo A).</w:t>
+      </w:r>
+    </w:p>
+    <w:p>
+      <w:pPr>
+        <w:pStyle w:val="Heading2"/>
+        <w:keepNext/>
+        <w:spacing w:after="120" w:before="240"/>
+      </w:pPr>
+      <w:r>
+        <w:rPr>
+          <w:rFonts w:ascii="Calibri" w:cs="Calibri" w:eastAsia="Calibri" w:hAnsi="Calibri"/>
+          <w:b/>
+          <w:bCs/>
+          <w:color w:val="2F5496"/>
+          <w:sz w:val="25"/>
+          <w:szCs w:val="25"/>
+        </w:rPr>
+        <w:t xml:space="preserve">5.4 Ahorro de batería del nodo C3</w:t>
+      </w:r>
+    </w:p>
+    <w:p>
+      <w:pPr>
+        <w:spacing w:after="120" w:line="276"/>
+      </w:pPr>
+      <w:r>
+        <w:rPr>
+          <w:rFonts w:ascii="Calibri" w:cs="Calibri" w:eastAsia="Calibri" w:hAnsi="Calibri"/>
+          <w:sz w:val="22"/>
+          <w:szCs w:val="22"/>
+        </w:rPr>
+        <w:t xml:space="preserve">Cada nodo C3 llevará un solo sensor (PIR o contacto magnético) y se alimentará con 2 pilas AAA a través de un convertidor buck-boost TPS63020. En la versión anterior el nodo mantenía el procesador y la radio siempre encendidos (del orden de 60 mA), lo que agotaría las pilas en pocos días. Se hicieron los cambios siguientes en nodo_c3.ino y nodo_sensor.ino:</w:t>
+      </w:r>
+    </w:p>
+    <w:tbl>
+      <w:tblPr>
+        <w:tblW w:type="dxa" w:w="9360"/>
+        <w:tblBorders>
+          <w:top w:val="single" w:color="auto" w:sz="4"/>
+          <w:left w:val="single" w:color="auto" w:sz="4"/>
+          <w:bottom w:val="single" w:color="auto" w:sz="4"/>
+          <w:right w:val="single" w:color="auto" w:sz="4"/>
+          <w:insideH w:val="single" w:color="auto" w:sz="4"/>
+          <w:insideV w:val="single" w:color="auto" w:sz="4"/>
+        </w:tblBorders>
+      </w:tblPr>
+      <w:tblGrid>
+        <w:gridCol w:w="2600"/>
+        <w:gridCol w:w="6760"/>
+      </w:tblGrid>
+      <w:tr>
+        <w:trPr>
+          <w:tblHeader/>
+        </w:trPr>
+        <w:tc>
+          <w:tcPr>
+            <w:tcW w:type="dxa" w:w="2600"/>
+            <w:tcBorders>
+              <w:top w:val="single" w:color="BFBFBF" w:sz="4"/>
+              <w:left w:val="single" w:color="BFBFBF" w:sz="4"/>
+              <w:bottom w:val="single" w:color="BFBFBF" w:sz="4"/>
+              <w:right w:val="single" w:color="BFBFBF" w:sz="4"/>
+            </w:tcBorders>
+            <w:shd w:fill="D9E2F3" w:color="auto" w:val="clear"/>
+            <w:tcMar>
+              <w:top w:type="dxa" w:w="60"/>
+              <w:left w:type="dxa" w:w="90"/>
+              <w:bottom w:type="dxa" w:w="60"/>
+              <w:right w:type="dxa" w:w="90"/>
+            </w:tcMar>
+          </w:tcPr>
+          <w:p>
+            <w:pPr>
+              <w:spacing w:after="20"/>
+            </w:pPr>
+            <w:r>
+              <w:rPr>
+                <w:rFonts w:ascii="Calibri" w:cs="Calibri" w:eastAsia="Calibri" w:hAnsi="Calibri"/>
+                <w:b/>
+                <w:bCs/>
+                <w:sz w:val="19"/>
+                <w:szCs w:val="19"/>
+              </w:rPr>
+              <w:t xml:space="preserve">Medida</w:t>
+            </w:r>
+          </w:p>
+        </w:tc>
+        <w:tc>
+          <w:tcPr>
+            <w:tcW w:type="dxa" w:w="6760"/>
+            <w:tcBorders>
+              <w:top w:val="single" w:color="BFBFBF" w:sz="4"/>
+              <w:left w:val="single" w:color="BFBFBF" w:sz="4"/>
+              <w:bottom w:val="single" w:color="BFBFBF" w:sz="4"/>
+              <w:right w:val="single" w:color="BFBFBF" w:sz="4"/>
+            </w:tcBorders>
+            <w:shd w:fill="D9E2F3" w:color="auto" w:val="clear"/>
+            <w:tcMar>
+              <w:top w:type="dxa" w:w="60"/>
+              <w:left w:type="dxa" w:w="90"/>
+              <w:bottom w:type="dxa" w:w="60"/>
+              <w:right w:type="dxa" w:w="90"/>
+            </w:tcMar>
+          </w:tcPr>
+          <w:p>
+            <w:pPr>
+              <w:spacing w:after="20"/>
+            </w:pPr>
+            <w:r>
+              <w:rPr>
+                <w:rFonts w:ascii="Calibri" w:cs="Calibri" w:eastAsia="Calibri" w:hAnsi="Calibri"/>
+                <w:b/>
+                <w:bCs/>
+                <w:sz w:val="19"/>
+                <w:szCs w:val="19"/>
+              </w:rPr>
+              <w:t xml:space="preserve">Descripción</w:t>
+            </w:r>
+          </w:p>
+        </w:tc>
+      </w:tr>
+      <w:tr>
+        <w:trPr>
+          <w:tblHeader w:val="off"/>
+        </w:trPr>
+        <w:tc>
+          <w:tcPr>
+            <w:tcW w:type="dxa" w:w="2600"/>
+            <w:tcBorders>
+              <w:top w:val="single" w:color="BFBFBF" w:sz="4"/>
+              <w:left w:val="single" w:color="BFBFBF" w:sz="4"/>
+              <w:bottom w:val="single" w:color="BFBFBF" w:sz="4"/>
+              <w:right w:val="single" w:color="BFBFBF" w:sz="4"/>
+            </w:tcBorders>
+            <w:tcMar>
+              <w:top w:type="dxa" w:w="60"/>
+              <w:left w:type="dxa" w:w="90"/>
+              <w:bottom w:type="dxa" w:w="60"/>
+              <w:right w:type="dxa" w:w="90"/>
+            </w:tcMar>
+          </w:tcPr>
+          <w:p>
+            <w:pPr>
+              <w:spacing w:after="20"/>
+            </w:pPr>
+            <w:r>
+              <w:rPr>
+                <w:rFonts w:ascii="Calibri" w:cs="Calibri" w:eastAsia="Calibri" w:hAnsi="Calibri"/>
+                <w:b w:val="false"/>
+                <w:bCs w:val="false"/>
+                <w:sz w:val="19"/>
+                <w:szCs w:val="19"/>
+              </w:rPr>
+              <w:t xml:space="preserve">Suspensión ligera con radio apagada</w:t>
+            </w:r>
+          </w:p>
+        </w:tc>
+        <w:tc>
+          <w:tcPr>
+            <w:tcW w:type="dxa" w:w="6760"/>
+            <w:tcBorders>
+              <w:top w:val="single" w:color="BFBFBF" w:sz="4"/>
+              <w:left w:val="single" w:color="BFBFBF" w:sz="4"/>
+              <w:bottom w:val="single" w:color="BFBFBF" w:sz="4"/>
+              <w:right w:val="single" w:color="BFBFBF" w:sz="4"/>
+            </w:tcBorders>
+            <w:tcMar>
+              <w:top w:type="dxa" w:w="60"/>
+              <w:left w:type="dxa" w:w="90"/>
+              <w:bottom w:type="dxa" w:w="60"/>
+              <w:right w:type="dxa" w:w="90"/>
+            </w:tcMar>
+          </w:tcPr>
+          <w:p>
+            <w:pPr>
+              <w:spacing w:after="20"/>
+            </w:pPr>
+            <w:r>
+              <w:rPr>
+                <w:rFonts w:ascii="Calibri" w:cs="Calibri" w:eastAsia="Calibri" w:hAnsi="Calibri"/>
+                <w:b w:val="false"/>
+                <w:bCs w:val="false"/>
+                <w:sz w:val="19"/>
+                <w:szCs w:val="19"/>
+              </w:rPr>
+              <w:t xml:space="preserve">Entre eventos el nodo duerme (≈ 0.15–0.2 mA). Lo despierta un cambio del contacto (se espera siempre el nivel contrario al actual, de modo que abrir y cerrar despiertan), el PIR en alto o un temporizador. El contacto magnético queda siempre activo y envía cada cambio al instante.</w:t>
+            </w:r>
+          </w:p>
+        </w:tc>
+      </w:tr>
+      <w:tr>
+        <w:trPr>
+          <w:tblHeader w:val="off"/>
+        </w:trPr>
+        <w:tc>
+          <w:tcPr>
+            <w:tcW w:type="dxa" w:w="2600"/>
+            <w:tcBorders>
+              <w:top w:val="single" w:color="BFBFBF" w:sz="4"/>
+              <w:left w:val="single" w:color="BFBFBF" w:sz="4"/>
+              <w:bottom w:val="single" w:color="BFBFBF" w:sz="4"/>
+              <w:right w:val="single" w:color="BFBFBF" w:sz="4"/>
+            </w:tcBorders>
+            <w:tcMar>
+              <w:top w:type="dxa" w:w="60"/>
+              <w:left w:type="dxa" w:w="90"/>
+              <w:bottom w:type="dxa" w:w="60"/>
+              <w:right w:type="dxa" w:w="90"/>
+            </w:tcMar>
+          </w:tcPr>
+          <w:p>
+            <w:pPr>
+              <w:spacing w:after="20"/>
+            </w:pPr>
+            <w:r>
+              <w:rPr>
+                <w:rFonts w:ascii="Calibri" w:cs="Calibri" w:eastAsia="Calibri" w:hAnsi="Calibri"/>
+                <w:b w:val="false"/>
+                <w:bCs w:val="false"/>
+                <w:sz w:val="19"/>
+                <w:szCs w:val="19"/>
+              </w:rPr>
+              <w:t xml:space="preserve">PIR solo con la casa armada</w:t>
+            </w:r>
+          </w:p>
+        </w:tc>
+        <w:tc>
+          <w:tcPr>
+            <w:tcW w:type="dxa" w:w="6760"/>
+            <w:tcBorders>
+              <w:top w:val="single" w:color="BFBFBF" w:sz="4"/>
+              <w:left w:val="single" w:color="BFBFBF" w:sz="4"/>
+              <w:bottom w:val="single" w:color="BFBFBF" w:sz="4"/>
+              <w:right w:val="single" w:color="BFBFBF" w:sz="4"/>
+            </w:tcBorders>
+            <w:tcMar>
+              <w:top w:type="dxa" w:w="60"/>
+              <w:left w:type="dxa" w:w="90"/>
+              <w:bottom w:type="dxa" w:w="60"/>
+              <w:right w:type="dxa" w:w="90"/>
+            </w:tcMar>
+          </w:tcPr>
+          <w:p>
+            <w:pPr>
+              <w:spacing w:after="20"/>
+            </w:pPr>
+            <w:r>
+              <w:rPr>
+                <w:rFonts w:ascii="Calibri" w:cs="Calibri" w:eastAsia="Calibri" w:hAnsi="Calibri"/>
+                <w:b w:val="false"/>
+                <w:bCs w:val="false"/>
+                <w:sz w:val="19"/>
+                <w:szCs w:val="19"/>
+              </w:rPr>
+              <w:t xml:space="preserve">El concentrador contesta a cada transmisión con un paquete TIPO_ARMADO (valor 1 o 0), enviado por broadcast desde la propia función de recepción para llegar dentro de la breve ventana de escucha del nodo (30 ms). Con la casa desarmada el PIR no despierta al nodo. Mientras no sabe el estado, el nodo asume armado.</w:t>
+            </w:r>
+          </w:p>
+        </w:tc>
+      </w:tr>
+      <w:tr>
+        <w:trPr>
+          <w:tblHeader w:val="off"/>
+        </w:trPr>
+        <w:tc>
+          <w:tcPr>
+            <w:tcW w:type="dxa" w:w="2600"/>
+            <w:tcBorders>
+              <w:top w:val="single" w:color="BFBFBF" w:sz="4"/>
+              <w:left w:val="single" w:color="BFBFBF" w:sz="4"/>
+              <w:bottom w:val="single" w:color="BFBFBF" w:sz="4"/>
+              <w:right w:val="single" w:color="BFBFBF" w:sz="4"/>
+            </w:tcBorders>
+            <w:tcMar>
+              <w:top w:type="dxa" w:w="60"/>
+              <w:left w:type="dxa" w:w="90"/>
+              <w:bottom w:type="dxa" w:w="60"/>
+              <w:right w:type="dxa" w:w="90"/>
+            </w:tcMar>
+          </w:tcPr>
+          <w:p>
+            <w:pPr>
+              <w:spacing w:after="20"/>
+            </w:pPr>
+            <w:r>
+              <w:rPr>
+                <w:rFonts w:ascii="Calibri" w:cs="Calibri" w:eastAsia="Calibri" w:hAnsi="Calibri"/>
+                <w:b w:val="false"/>
+                <w:bCs w:val="false"/>
+                <w:sz w:val="19"/>
+                <w:szCs w:val="19"/>
+              </w:rPr>
+              <w:t xml:space="preserve">Latido según el sensor</w:t>
+            </w:r>
+          </w:p>
+        </w:tc>
+        <w:tc>
+          <w:tcPr>
+            <w:tcW w:type="dxa" w:w="6760"/>
+            <w:tcBorders>
+              <w:top w:val="single" w:color="BFBFBF" w:sz="4"/>
+              <w:left w:val="single" w:color="BFBFBF" w:sz="4"/>
+              <w:bottom w:val="single" w:color="BFBFBF" w:sz="4"/>
+              <w:right w:val="single" w:color="BFBFBF" w:sz="4"/>
+            </w:tcBorders>
+            <w:tcMar>
+              <w:top w:type="dxa" w:w="60"/>
+              <w:left w:type="dxa" w:w="90"/>
+              <w:bottom w:type="dxa" w:w="60"/>
+              <w:right w:type="dxa" w:w="90"/>
+            </w:tcMar>
+          </w:tcPr>
+          <w:p>
+            <w:pPr>
+              <w:spacing w:after="20"/>
+            </w:pPr>
+            <w:r>
+              <w:rPr>
+                <w:rFonts w:ascii="Calibri" w:cs="Calibri" w:eastAsia="Calibri" w:hAnsi="Calibri"/>
+                <w:b w:val="false"/>
+                <w:bCs w:val="false"/>
+                <w:sz w:val="19"/>
+                <w:szCs w:val="19"/>
+              </w:rPr>
+              <w:t xml:space="preserve">El nodo PIR hace latido cada 20 s porque con él se entera del estado de armado. El nodo magnético no necesita ese dato y lo hace cada 60 s. El backend da un nodo por perdido a los 120 s.</w:t>
+            </w:r>
+          </w:p>
+        </w:tc>
+      </w:tr>
+      <w:tr>
+        <w:trPr>
+          <w:tblHeader w:val="off"/>
+        </w:trPr>
+        <w:tc>
+          <w:tcPr>
+            <w:tcW w:type="dxa" w:w="2600"/>
+            <w:tcBorders>
+              <w:top w:val="single" w:color="BFBFBF" w:sz="4"/>
+              <w:left w:val="single" w:color="BFBFBF" w:sz="4"/>
+              <w:bottom w:val="single" w:color="BFBFBF" w:sz="4"/>
+              <w:right w:val="single" w:color="BFBFBF" w:sz="4"/>
+            </w:tcBorders>
+            <w:tcMar>
+              <w:top w:type="dxa" w:w="60"/>
+              <w:left w:type="dxa" w:w="90"/>
+              <w:bottom w:type="dxa" w:w="60"/>
+              <w:right w:type="dxa" w:w="90"/>
+            </w:tcMar>
+          </w:tcPr>
+          <w:p>
+            <w:pPr>
+              <w:spacing w:after="20"/>
+            </w:pPr>
+            <w:r>
+              <w:rPr>
+                <w:rFonts w:ascii="Calibri" w:cs="Calibri" w:eastAsia="Calibri" w:hAnsi="Calibri"/>
+                <w:b w:val="false"/>
+                <w:bCs w:val="false"/>
+                <w:sz w:val="19"/>
+                <w:szCs w:val="19"/>
+              </w:rPr>
+              <w:t xml:space="preserve">Latido pospuesto</w:t>
+            </w:r>
+          </w:p>
+        </w:tc>
+        <w:tc>
+          <w:tcPr>
+            <w:tcW w:type="dxa" w:w="6760"/>
+            <w:tcBorders>
+              <w:top w:val="single" w:color="BFBFBF" w:sz="4"/>
+              <w:left w:val="single" w:color="BFBFBF" w:sz="4"/>
+              <w:bottom w:val="single" w:color="BFBFBF" w:sz="4"/>
+              <w:right w:val="single" w:color="BFBFBF" w:sz="4"/>
+            </w:tcBorders>
+            <w:tcMar>
+              <w:top w:type="dxa" w:w="60"/>
+              <w:left w:type="dxa" w:w="90"/>
+              <w:bottom w:type="dxa" w:w="60"/>
+              <w:right w:type="dxa" w:w="90"/>
+            </w:tcMar>
+          </w:tcPr>
+          <w:p>
+            <w:pPr>
+              <w:spacing w:after="20"/>
+            </w:pPr>
+            <w:r>
+              <w:rPr>
+                <w:rFonts w:ascii="Calibri" w:cs="Calibri" w:eastAsia="Calibri" w:hAnsi="Calibri"/>
+                <w:b w:val="false"/>
+                <w:bCs w:val="false"/>
+                <w:sz w:val="19"/>
+                <w:szCs w:val="19"/>
+              </w:rPr>
+              <w:t xml:space="preserve">Cualquier paquete enviado cuenta como latido, así que el nodo no despierta de más.</w:t>
+            </w:r>
+          </w:p>
+        </w:tc>
+      </w:tr>
+      <w:tr>
+        <w:trPr>
+          <w:tblHeader w:val="off"/>
+        </w:trPr>
+        <w:tc>
+          <w:tcPr>
+            <w:tcW w:type="dxa" w:w="2600"/>
+            <w:tcBorders>
+              <w:top w:val="single" w:color="BFBFBF" w:sz="4"/>
+              <w:left w:val="single" w:color="BFBFBF" w:sz="4"/>
+              <w:bottom w:val="single" w:color="BFBFBF" w:sz="4"/>
+              <w:right w:val="single" w:color="BFBFBF" w:sz="4"/>
+            </w:tcBorders>
+            <w:tcMar>
+              <w:top w:type="dxa" w:w="60"/>
+              <w:left w:type="dxa" w:w="90"/>
+              <w:bottom w:type="dxa" w:w="60"/>
+              <w:right w:type="dxa" w:w="90"/>
+            </w:tcMar>
+          </w:tcPr>
+          <w:p>
+            <w:pPr>
+              <w:spacing w:after="20"/>
+            </w:pPr>
+            <w:r>
+              <w:rPr>
+                <w:rFonts w:ascii="Calibri" w:cs="Calibri" w:eastAsia="Calibri" w:hAnsi="Calibri"/>
+                <w:b w:val="false"/>
+                <w:bCs w:val="false"/>
+                <w:sz w:val="19"/>
+                <w:szCs w:val="19"/>
+              </w:rPr>
+              <w:t xml:space="preserve">Radio solo cuando hace falta</w:t>
+            </w:r>
+          </w:p>
+        </w:tc>
+        <w:tc>
+          <w:tcPr>
+            <w:tcW w:type="dxa" w:w="6760"/>
+            <w:tcBorders>
+              <w:top w:val="single" w:color="BFBFBF" w:sz="4"/>
+              <w:left w:val="single" w:color="BFBFBF" w:sz="4"/>
+              <w:bottom w:val="single" w:color="BFBFBF" w:sz="4"/>
+              <w:right w:val="single" w:color="BFBFBF" w:sz="4"/>
+            </w:tcBorders>
+            <w:tcMar>
+              <w:top w:type="dxa" w:w="60"/>
+              <w:left w:type="dxa" w:w="90"/>
+              <w:bottom w:type="dxa" w:w="60"/>
+              <w:right w:type="dxa" w:w="90"/>
+            </w:tcMar>
+          </w:tcPr>
+          <w:p>
+            <w:pPr>
+              <w:spacing w:after="20"/>
+            </w:pPr>
+            <w:r>
+              <w:rPr>
+                <w:rFonts w:ascii="Calibri" w:cs="Calibri" w:eastAsia="Calibri" w:hAnsi="Calibri"/>
+                <w:b w:val="false"/>
+                <w:bCs w:val="false"/>
+                <w:sz w:val="19"/>
+                <w:szCs w:val="19"/>
+              </w:rPr>
+              <w:t xml:space="preserve">El Wi-Fi y ESP-NOW se encienden únicamente para transmitir y se apagan antes de dormir. Si el concentrador no responde, el intervalo de búsqueda se duplica hasta 60 s.</w:t>
+            </w:r>
+          </w:p>
+        </w:tc>
+      </w:tr>
+      <w:tr>
+        <w:trPr>
+          <w:tblHeader w:val="off"/>
+        </w:trPr>
+        <w:tc>
+          <w:tcPr>
+            <w:tcW w:type="dxa" w:w="2600"/>
+            <w:tcBorders>
+              <w:top w:val="single" w:color="BFBFBF" w:sz="4"/>
+              <w:left w:val="single" w:color="BFBFBF" w:sz="4"/>
+              <w:bottom w:val="single" w:color="BFBFBF" w:sz="4"/>
+              <w:right w:val="single" w:color="BFBFBF" w:sz="4"/>
+            </w:tcBorders>
+            <w:tcMar>
+              <w:top w:type="dxa" w:w="60"/>
+              <w:left w:type="dxa" w:w="90"/>
+              <w:bottom w:type="dxa" w:w="60"/>
+              <w:right w:type="dxa" w:w="90"/>
+            </w:tcMar>
+          </w:tcPr>
+          <w:p>
+            <w:pPr>
+              <w:spacing w:after="20"/>
+            </w:pPr>
+            <w:r>
+              <w:rPr>
+                <w:rFonts w:ascii="Calibri" w:cs="Calibri" w:eastAsia="Calibri" w:hAnsi="Calibri"/>
+                <w:b w:val="false"/>
+                <w:bCs w:val="false"/>
+                <w:sz w:val="19"/>
+                <w:szCs w:val="19"/>
+              </w:rPr>
+              <w:t xml:space="preserve">Otros ajustes</w:t>
+            </w:r>
+          </w:p>
+        </w:tc>
+        <w:tc>
+          <w:tcPr>
+            <w:tcW w:type="dxa" w:w="6760"/>
+            <w:tcBorders>
+              <w:top w:val="single" w:color="BFBFBF" w:sz="4"/>
+              <w:left w:val="single" w:color="BFBFBF" w:sz="4"/>
+              <w:bottom w:val="single" w:color="BFBFBF" w:sz="4"/>
+              <w:right w:val="single" w:color="BFBFBF" w:sz="4"/>
+            </w:tcBorders>
+            <w:tcMar>
+              <w:top w:type="dxa" w:w="60"/>
+              <w:left w:type="dxa" w:w="90"/>
+              <w:bottom w:type="dxa" w:w="60"/>
+              <w:right w:type="dxa" w:w="90"/>
+            </w:tcMar>
+          </w:tcPr>
+          <w:p>
+            <w:pPr>
+              <w:spacing w:after="20"/>
+            </w:pPr>
+            <w:r>
+              <w:rPr>
+                <w:rFonts w:ascii="Calibri" w:cs="Calibri" w:eastAsia="Calibri" w:hAnsi="Calibri"/>
+                <w:b w:val="false"/>
+                <w:bCs w:val="false"/>
+                <w:sz w:val="19"/>
+                <w:szCs w:val="19"/>
+              </w:rPr>
+              <w:t xml:space="preserve">CPU a 80 MHz, configuración de Wi-Fi sin escritura en flash, entrada del PIR sin dejarla flotante cuando el nodo no lo lleva, potencia de transmisión configurable (sin cambio por defecto) y pull-up externo de 1 MΩ opcional en el contacto.</w:t>
+            </w:r>
+          </w:p>
+        </w:tc>
+      </w:tr>
+    </w:tbl>
+    <w:p>
+      <w:pPr>
+        <w:spacing w:after="120" w:line="276"/>
+      </w:pPr>
+      <w:r>
+        <w:rPr>
+          <w:rFonts w:ascii="Calibri" w:cs="Calibri" w:eastAsia="Calibri" w:hAnsi="Calibri"/>
+          <w:sz w:val="22"/>
+          <w:szCs w:val="22"/>
+        </w:rPr>
+        <w:t xml:space="preserve"/>
+      </w:r>
+    </w:p>
+    <w:p>
+      <w:pPr>
+        <w:keepNext/>
+        <w:spacing w:after="80" w:before="160"/>
+      </w:pPr>
+      <w:r>
+        <w:rPr>
+          <w:rFonts w:ascii="Calibri" w:cs="Calibri" w:eastAsia="Calibri" w:hAnsi="Calibri"/>
+          <w:b/>
+          <w:bCs/>
+          <w:color w:val="2F5496"/>
+          <w:sz w:val="23"/>
+          <w:szCs w:val="23"/>
+        </w:rPr>
+        <w:t xml:space="preserve">Estimación de duración (teórica)</w:t>
+      </w:r>
+    </w:p>
+    <w:p>
+      <w:pPr>
+        <w:spacing w:after="120" w:line="276"/>
+      </w:pPr>
+      <w:r>
+        <w:rPr>
+          <w:rFonts w:ascii="Calibri" w:cs="Calibri" w:eastAsia="Calibri" w:hAnsi="Calibri"/>
+          <w:sz w:val="22"/>
+          <w:szCs w:val="22"/>
+        </w:rPr>
+        <w:t xml:space="preserve">El convertidor TPS63020 admite entradas de 1.8 V a 5.5 V y consume unos 25 µA en reposo con su modo de ahorro activo (PS/SYNC a tierra), por lo que se aprovecha casi toda la carga de las pilas. Con una eficiencia supuesta de 80 % a carga ligera, pilas alcalinas AAA de ≈ 1100 mAh y un despertar de ≈ 150 ms a ≈ 70 mA:</w:t>
+      </w:r>
+    </w:p>
+    <w:tbl>
+      <w:tblPr>
+        <w:tblW w:type="dxa" w:w="9360"/>
+        <w:tblBorders>
+          <w:top w:val="single" w:color="auto" w:sz="4"/>
+          <w:left w:val="single" w:color="auto" w:sz="4"/>
+          <w:bottom w:val="single" w:color="auto" w:sz="4"/>
+          <w:right w:val="single" w:color="auto" w:sz="4"/>
+          <w:insideH w:val="single" w:color="auto" w:sz="4"/>
+          <w:insideV w:val="single" w:color="auto" w:sz="4"/>
+        </w:tblBorders>
+      </w:tblPr>
+      <w:tblGrid>
+        <w:gridCol w:w="2800"/>
+        <w:gridCol w:w="2000"/>
+        <w:gridCol w:w="2200"/>
+        <w:gridCol w:w="2360"/>
+      </w:tblGrid>
+      <w:tr>
+        <w:trPr>
+          <w:tblHeader/>
+        </w:trPr>
+        <w:tc>
+          <w:tcPr>
+            <w:tcW w:type="dxa" w:w="2800"/>
+            <w:tcBorders>
+              <w:top w:val="single" w:color="BFBFBF" w:sz="4"/>
+              <w:left w:val="single" w:color="BFBFBF" w:sz="4"/>
+              <w:bottom w:val="single" w:color="BFBFBF" w:sz="4"/>
+              <w:right w:val="single" w:color="BFBFBF" w:sz="4"/>
+            </w:tcBorders>
+            <w:shd w:fill="D9E2F3" w:color="auto" w:val="clear"/>
+            <w:tcMar>
+              <w:top w:type="dxa" w:w="60"/>
+              <w:left w:type="dxa" w:w="90"/>
+              <w:bottom w:type="dxa" w:w="60"/>
+              <w:right w:type="dxa" w:w="90"/>
+            </w:tcMar>
+          </w:tcPr>
+          <w:p>
+            <w:pPr>
+              <w:spacing w:after="20"/>
+            </w:pPr>
+            <w:r>
+              <w:rPr>
+                <w:rFonts w:ascii="Calibri" w:cs="Calibri" w:eastAsia="Calibri" w:hAnsi="Calibri"/>
+                <w:b/>
+                <w:bCs/>
+                <w:sz w:val="19"/>
+                <w:szCs w:val="19"/>
+              </w:rPr>
+              <w:t xml:space="preserve">Nodo</w:t>
+            </w:r>
+          </w:p>
+        </w:tc>
+        <w:tc>
+          <w:tcPr>
+            <w:tcW w:type="dxa" w:w="2000"/>
+            <w:tcBorders>
+              <w:top w:val="single" w:color="BFBFBF" w:sz="4"/>
+              <w:left w:val="single" w:color="BFBFBF" w:sz="4"/>
+              <w:bottom w:val="single" w:color="BFBFBF" w:sz="4"/>
+              <w:right w:val="single" w:color="BFBFBF" w:sz="4"/>
+            </w:tcBorders>
+            <w:shd w:fill="D9E2F3" w:color="auto" w:val="clear"/>
+            <w:tcMar>
+              <w:top w:type="dxa" w:w="60"/>
+              <w:left w:type="dxa" w:w="90"/>
+              <w:bottom w:type="dxa" w:w="60"/>
+              <w:right w:type="dxa" w:w="90"/>
+            </w:tcMar>
+          </w:tcPr>
+          <w:p>
+            <w:pPr>
+              <w:spacing w:after="20"/>
+            </w:pPr>
+            <w:r>
+              <w:rPr>
+                <w:rFonts w:ascii="Calibri" w:cs="Calibri" w:eastAsia="Calibri" w:hAnsi="Calibri"/>
+                <w:b/>
+                <w:bCs/>
+                <w:sz w:val="19"/>
+                <w:szCs w:val="19"/>
+              </w:rPr>
+              <w:t xml:space="preserve">Consumo en la salida</w:t>
+            </w:r>
+          </w:p>
+        </w:tc>
+        <w:tc>
+          <w:tcPr>
+            <w:tcW w:type="dxa" w:w="2200"/>
+            <w:tcBorders>
+              <w:top w:val="single" w:color="BFBFBF" w:sz="4"/>
+              <w:left w:val="single" w:color="BFBFBF" w:sz="4"/>
+              <w:bottom w:val="single" w:color="BFBFBF" w:sz="4"/>
+              <w:right w:val="single" w:color="BFBFBF" w:sz="4"/>
+            </w:tcBorders>
+            <w:shd w:fill="D9E2F3" w:color="auto" w:val="clear"/>
+            <w:tcMar>
+              <w:top w:type="dxa" w:w="60"/>
+              <w:left w:type="dxa" w:w="90"/>
+              <w:bottom w:type="dxa" w:w="60"/>
+              <w:right w:type="dxa" w:w="90"/>
+            </w:tcMar>
+          </w:tcPr>
+          <w:p>
+            <w:pPr>
+              <w:spacing w:after="20"/>
+            </w:pPr>
+            <w:r>
+              <w:rPr>
+                <w:rFonts w:ascii="Calibri" w:cs="Calibri" w:eastAsia="Calibri" w:hAnsi="Calibri"/>
+                <w:b/>
+                <w:bCs/>
+                <w:sz w:val="19"/>
+                <w:szCs w:val="19"/>
+              </w:rPr>
+              <w:t xml:space="preserve">Corriente de las pilas</w:t>
+            </w:r>
+          </w:p>
+        </w:tc>
+        <w:tc>
+          <w:tcPr>
+            <w:tcW w:type="dxa" w:w="2360"/>
+            <w:tcBorders>
+              <w:top w:val="single" w:color="BFBFBF" w:sz="4"/>
+              <w:left w:val="single" w:color="BFBFBF" w:sz="4"/>
+              <w:bottom w:val="single" w:color="BFBFBF" w:sz="4"/>
+              <w:right w:val="single" w:color="BFBFBF" w:sz="4"/>
+            </w:tcBorders>
+            <w:shd w:fill="D9E2F3" w:color="auto" w:val="clear"/>
+            <w:tcMar>
+              <w:top w:type="dxa" w:w="60"/>
+              <w:left w:type="dxa" w:w="90"/>
+              <w:bottom w:type="dxa" w:w="60"/>
+              <w:right w:type="dxa" w:w="90"/>
+            </w:tcMar>
+          </w:tcPr>
+          <w:p>
+            <w:pPr>
+              <w:spacing w:after="20"/>
+            </w:pPr>
+            <w:r>
+              <w:rPr>
+                <w:rFonts w:ascii="Calibri" w:cs="Calibri" w:eastAsia="Calibri" w:hAnsi="Calibri"/>
+                <w:b/>
+                <w:bCs/>
+                <w:sz w:val="19"/>
+                <w:szCs w:val="19"/>
+              </w:rPr>
+              <w:t xml:space="preserve">Duración con 2 AAA alcalinas</w:t>
+            </w:r>
+          </w:p>
+        </w:tc>
+      </w:tr>
+      <w:tr>
+        <w:trPr>
+          <w:tblHeader w:val="off"/>
+        </w:trPr>
+        <w:tc>
+          <w:tcPr>
+            <w:tcW w:type="dxa" w:w="2800"/>
+            <w:tcBorders>
+              <w:top w:val="single" w:color="BFBFBF" w:sz="4"/>
+              <w:left w:val="single" w:color="BFBFBF" w:sz="4"/>
+              <w:bottom w:val="single" w:color="BFBFBF" w:sz="4"/>
+              <w:right w:val="single" w:color="BFBFBF" w:sz="4"/>
+            </w:tcBorders>
+            <w:tcMar>
+              <w:top w:type="dxa" w:w="60"/>
+              <w:left w:type="dxa" w:w="90"/>
+              <w:bottom w:type="dxa" w:w="60"/>
+              <w:right w:type="dxa" w:w="90"/>
+            </w:tcMar>
+          </w:tcPr>
+          <w:p>
+            <w:pPr>
+              <w:spacing w:after="20"/>
+            </w:pPr>
+            <w:r>
+              <w:rPr>
+                <w:rFonts w:ascii="Calibri" w:cs="Calibri" w:eastAsia="Calibri" w:hAnsi="Calibri"/>
+                <w:b w:val="false"/>
+                <w:bCs w:val="false"/>
+                <w:sz w:val="19"/>
+                <w:szCs w:val="19"/>
+              </w:rPr>
+              <w:t xml:space="preserve">PIR (latido 20 s)</w:t>
+            </w:r>
+          </w:p>
+        </w:tc>
+        <w:tc>
+          <w:tcPr>
+            <w:tcW w:type="dxa" w:w="2000"/>
+            <w:tcBorders>
+              <w:top w:val="single" w:color="BFBFBF" w:sz="4"/>
+              <w:left w:val="single" w:color="BFBFBF" w:sz="4"/>
+              <w:bottom w:val="single" w:color="BFBFBF" w:sz="4"/>
+              <w:right w:val="single" w:color="BFBFBF" w:sz="4"/>
+            </w:tcBorders>
+            <w:tcMar>
+              <w:top w:type="dxa" w:w="60"/>
+              <w:left w:type="dxa" w:w="90"/>
+              <w:bottom w:type="dxa" w:w="60"/>
+              <w:right w:type="dxa" w:w="90"/>
+            </w:tcMar>
+          </w:tcPr>
+          <w:p>
+            <w:pPr>
+              <w:spacing w:after="20"/>
+            </w:pPr>
+            <w:r>
+              <w:rPr>
+                <w:rFonts w:ascii="Calibri" w:cs="Calibri" w:eastAsia="Calibri" w:hAnsi="Calibri"/>
+                <w:b w:val="false"/>
+                <w:bCs w:val="false"/>
+                <w:sz w:val="19"/>
+                <w:szCs w:val="19"/>
+              </w:rPr>
+              <w:t xml:space="preserve">≈ 0.65 mA</w:t>
+            </w:r>
+          </w:p>
+        </w:tc>
+        <w:tc>
+          <w:tcPr>
+            <w:tcW w:type="dxa" w:w="2200"/>
+            <w:tcBorders>
+              <w:top w:val="single" w:color="BFBFBF" w:sz="4"/>
+              <w:left w:val="single" w:color="BFBFBF" w:sz="4"/>
+              <w:bottom w:val="single" w:color="BFBFBF" w:sz="4"/>
+              <w:right w:val="single" w:color="BFBFBF" w:sz="4"/>
+            </w:tcBorders>
+            <w:tcMar>
+              <w:top w:type="dxa" w:w="60"/>
+              <w:left w:type="dxa" w:w="90"/>
+              <w:bottom w:type="dxa" w:w="60"/>
+              <w:right w:type="dxa" w:w="90"/>
+            </w:tcMar>
+          </w:tcPr>
+          <w:p>
+            <w:pPr>
+              <w:spacing w:after="20"/>
+            </w:pPr>
+            <w:r>
+              <w:rPr>
+                <w:rFonts w:ascii="Calibri" w:cs="Calibri" w:eastAsia="Calibri" w:hAnsi="Calibri"/>
+                <w:b w:val="false"/>
+                <w:bCs w:val="false"/>
+                <w:sz w:val="19"/>
+                <w:szCs w:val="19"/>
+              </w:rPr>
+              <w:t xml:space="preserve">≈ 1.1 mA</w:t>
+            </w:r>
+          </w:p>
+        </w:tc>
+        <w:tc>
+          <w:tcPr>
+            <w:tcW w:type="dxa" w:w="2360"/>
+            <w:tcBorders>
+              <w:top w:val="single" w:color="BFBFBF" w:sz="4"/>
+              <w:left w:val="single" w:color="BFBFBF" w:sz="4"/>
+              <w:bottom w:val="single" w:color="BFBFBF" w:sz="4"/>
+              <w:right w:val="single" w:color="BFBFBF" w:sz="4"/>
+            </w:tcBorders>
+            <w:tcMar>
+              <w:top w:type="dxa" w:w="60"/>
+              <w:left w:type="dxa" w:w="90"/>
+              <w:bottom w:type="dxa" w:w="60"/>
+              <w:right w:type="dxa" w:w="90"/>
+            </w:tcMar>
+          </w:tcPr>
+          <w:p>
+            <w:pPr>
+              <w:spacing w:after="20"/>
+            </w:pPr>
+            <w:r>
+              <w:rPr>
+                <w:rFonts w:ascii="Calibri" w:cs="Calibri" w:eastAsia="Calibri" w:hAnsi="Calibri"/>
+                <w:b w:val="false"/>
+                <w:bCs w:val="false"/>
+                <w:sz w:val="19"/>
+                <w:szCs w:val="19"/>
+              </w:rPr>
+              <w:t xml:space="preserve">≈ 40 días</w:t>
+            </w:r>
+          </w:p>
+        </w:tc>
+      </w:tr>
+      <w:tr>
+        <w:trPr>
+          <w:tblHeader w:val="off"/>
+        </w:trPr>
+        <w:tc>
+          <w:tcPr>
+            <w:tcW w:type="dxa" w:w="2800"/>
+            <w:tcBorders>
+              <w:top w:val="single" w:color="BFBFBF" w:sz="4"/>
+              <w:left w:val="single" w:color="BFBFBF" w:sz="4"/>
+              <w:bottom w:val="single" w:color="BFBFBF" w:sz="4"/>
+              <w:right w:val="single" w:color="BFBFBF" w:sz="4"/>
+            </w:tcBorders>
+            <w:tcMar>
+              <w:top w:type="dxa" w:w="60"/>
+              <w:left w:type="dxa" w:w="90"/>
+              <w:bottom w:type="dxa" w:w="60"/>
+              <w:right w:type="dxa" w:w="90"/>
+            </w:tcMar>
+          </w:tcPr>
+          <w:p>
+            <w:pPr>
+              <w:spacing w:after="20"/>
+            </w:pPr>
+            <w:r>
+              <w:rPr>
+                <w:rFonts w:ascii="Calibri" w:cs="Calibri" w:eastAsia="Calibri" w:hAnsi="Calibri"/>
+                <w:b w:val="false"/>
+                <w:bCs w:val="false"/>
+                <w:sz w:val="19"/>
+                <w:szCs w:val="19"/>
+              </w:rPr>
+              <w:t xml:space="preserve">Magnético (latido 60 s, pull-up 1 MΩ)</w:t>
+            </w:r>
+          </w:p>
+        </w:tc>
+        <w:tc>
+          <w:tcPr>
+            <w:tcW w:type="dxa" w:w="2000"/>
+            <w:tcBorders>
+              <w:top w:val="single" w:color="BFBFBF" w:sz="4"/>
+              <w:left w:val="single" w:color="BFBFBF" w:sz="4"/>
+              <w:bottom w:val="single" w:color="BFBFBF" w:sz="4"/>
+              <w:right w:val="single" w:color="BFBFBF" w:sz="4"/>
+            </w:tcBorders>
+            <w:tcMar>
+              <w:top w:type="dxa" w:w="60"/>
+              <w:left w:type="dxa" w:w="90"/>
+              <w:bottom w:type="dxa" w:w="60"/>
+              <w:right w:type="dxa" w:w="90"/>
+            </w:tcMar>
+          </w:tcPr>
+          <w:p>
+            <w:pPr>
+              <w:spacing w:after="20"/>
+            </w:pPr>
+            <w:r>
+              <w:rPr>
+                <w:rFonts w:ascii="Calibri" w:cs="Calibri" w:eastAsia="Calibri" w:hAnsi="Calibri"/>
+                <w:b w:val="false"/>
+                <w:bCs w:val="false"/>
+                <w:sz w:val="19"/>
+                <w:szCs w:val="19"/>
+              </w:rPr>
+              <w:t xml:space="preserve">≈ 0.33 mA</w:t>
+            </w:r>
+          </w:p>
+        </w:tc>
+        <w:tc>
+          <w:tcPr>
+            <w:tcW w:type="dxa" w:w="2200"/>
+            <w:tcBorders>
+              <w:top w:val="single" w:color="BFBFBF" w:sz="4"/>
+              <w:left w:val="single" w:color="BFBFBF" w:sz="4"/>
+              <w:bottom w:val="single" w:color="BFBFBF" w:sz="4"/>
+              <w:right w:val="single" w:color="BFBFBF" w:sz="4"/>
+            </w:tcBorders>
+            <w:tcMar>
+              <w:top w:type="dxa" w:w="60"/>
+              <w:left w:type="dxa" w:w="90"/>
+              <w:bottom w:type="dxa" w:w="60"/>
+              <w:right w:type="dxa" w:w="90"/>
+            </w:tcMar>
+          </w:tcPr>
+          <w:p>
+            <w:pPr>
+              <w:spacing w:after="20"/>
+            </w:pPr>
+            <w:r>
+              <w:rPr>
+                <w:rFonts w:ascii="Calibri" w:cs="Calibri" w:eastAsia="Calibri" w:hAnsi="Calibri"/>
+                <w:b w:val="false"/>
+                <w:bCs w:val="false"/>
+                <w:sz w:val="19"/>
+                <w:szCs w:val="19"/>
+              </w:rPr>
+              <w:t xml:space="preserve">≈ 0.55 mA</w:t>
+            </w:r>
+          </w:p>
+        </w:tc>
+        <w:tc>
+          <w:tcPr>
+            <w:tcW w:type="dxa" w:w="2360"/>
+            <w:tcBorders>
+              <w:top w:val="single" w:color="BFBFBF" w:sz="4"/>
+              <w:left w:val="single" w:color="BFBFBF" w:sz="4"/>
+              <w:bottom w:val="single" w:color="BFBFBF" w:sz="4"/>
+              <w:right w:val="single" w:color="BFBFBF" w:sz="4"/>
+            </w:tcBorders>
+            <w:tcMar>
+              <w:top w:type="dxa" w:w="60"/>
+              <w:left w:type="dxa" w:w="90"/>
+              <w:bottom w:type="dxa" w:w="60"/>
+              <w:right w:type="dxa" w:w="90"/>
+            </w:tcMar>
+          </w:tcPr>
+          <w:p>
+            <w:pPr>
+              <w:spacing w:after="20"/>
+            </w:pPr>
+            <w:r>
+              <w:rPr>
+                <w:rFonts w:ascii="Calibri" w:cs="Calibri" w:eastAsia="Calibri" w:hAnsi="Calibri"/>
+                <w:b w:val="false"/>
+                <w:bCs w:val="false"/>
+                <w:sz w:val="19"/>
+                <w:szCs w:val="19"/>
+              </w:rPr>
+              <w:t xml:space="preserve">≈ 80 días</w:t>
+            </w:r>
+          </w:p>
+        </w:tc>
+      </w:tr>
+    </w:tbl>
+    <w:p>
+      <w:pPr>
+        <w:spacing w:after="120" w:line="276"/>
+      </w:pPr>
+      <w:r>
+        <w:rPr>
+          <w:rFonts w:ascii="Calibri" w:cs="Calibri" w:eastAsia="Calibri" w:hAnsi="Calibri"/>
+          <w:sz w:val="22"/>
+          <w:szCs w:val="22"/>
+        </w:rPr>
+        <w:t xml:space="preserve">Estas cifras son estimaciones de papel: la eficiencia real del convertidor a 0.2–1 mA y la duración real del despertar deben medirse con un amperímetro o un medidor de potencia. Con pilas AAA de litio se estiman unos 57 y 108 días respectivamente.</w:t>
+      </w:r>
+    </w:p>
+    <w:p>
+      <w:pPr>
+        <w:keepNext/>
+        <w:spacing w:after="80" w:before="160"/>
+      </w:pPr>
+      <w:r>
+        <w:rPr>
+          <w:rFonts w:ascii="Calibri" w:cs="Calibri" w:eastAsia="Calibri" w:hAnsi="Calibri"/>
+          <w:b/>
+          <w:bCs/>
+          <w:color w:val="2F5496"/>
+          <w:sz w:val="23"/>
+          <w:szCs w:val="23"/>
+        </w:rPr>
+        <w:t xml:space="preserve">Compromisos y decisiones</w:t>
+      </w:r>
+    </w:p>
+    <w:p>
+      <w:pPr>
+        <w:pStyle w:val="ListParagraph"/>
+        <w:numPr>
+          <w:ilvl w:val="0"/>
+          <w:numId w:val="2"/>
+        </w:numPr>
+        <w:spacing w:after="60"/>
+      </w:pPr>
+      <w:r>
+        <w:rPr>
+          <w:rFonts w:ascii="Calibri" w:cs="Calibri" w:eastAsia="Calibri" w:hAnsi="Calibri"/>
+          <w:sz w:val="22"/>
+          <w:szCs w:val="22"/>
+        </w:rPr>
+        <w:t xml:space="preserve">Armar o desarmar desde la app llega al nodo PIR en su siguiente latido, hasta 20 s después. En ese lapso un movimiento no se registra. Es el costo de no mantener la radio escuchando.</w:t>
+      </w:r>
+    </w:p>
+    <w:p>
+      <w:pPr>
+        <w:pStyle w:val="ListParagraph"/>
+        <w:numPr>
+          <w:ilvl w:val="0"/>
+          <w:numId w:val="2"/>
+        </w:numPr>
+        <w:spacing w:after="60"/>
+      </w:pPr>
+      <w:r>
+        <w:rPr>
+          <w:rFonts w:ascii="Calibri" w:cs="Calibri" w:eastAsia="Calibri" w:hAnsi="Calibri"/>
+          <w:sz w:val="22"/>
+          <w:szCs w:val="22"/>
+        </w:rPr>
+        <w:t xml:space="preserve">Con las pilas gastadas, las ráfagas de transmisión (hasta ≈ 300 mA) hacen caer la tensión de entrada; por eso se prevén capacitores de 100–220 µF en la salida y 47–100 µF en la entrada del convertidor.</w:t>
+      </w:r>
+    </w:p>
+    <w:p>
+      <w:pPr>
+        <w:pStyle w:val="ListParagraph"/>
+        <w:numPr>
+          <w:ilvl w:val="0"/>
+          <w:numId w:val="2"/>
+        </w:numPr>
+        <w:spacing w:after="60"/>
+      </w:pPr>
+      <w:r>
+        <w:rPr>
+          <w:rFonts w:ascii="Calibri" w:cs="Calibri" w:eastAsia="Calibri" w:hAnsi="Calibri"/>
+          <w:sz w:val="22"/>
+          <w:szCs w:val="22"/>
+        </w:rPr>
+        <w:t xml:space="preserve">Una placa de desarrollo con LED de encendido y regulador gasta 1–5 mA solo en reposo; para el nodo final se usará un módulo C3 sin esos elementos.</w:t>
+      </w:r>
+    </w:p>
+    <w:p>
+      <w:pPr>
+        <w:pStyle w:val="ListParagraph"/>
+        <w:numPr>
+          <w:ilvl w:val="0"/>
+          <w:numId w:val="2"/>
+        </w:numPr>
+        <w:spacing w:after="60"/>
+      </w:pPr>
+      <w:r>
+        <w:rPr>
+          <w:rFonts w:ascii="Calibri" w:cs="Calibri" w:eastAsia="Calibri" w:hAnsi="Calibri"/>
+          <w:sz w:val="22"/>
+          <w:szCs w:val="22"/>
+        </w:rPr>
+        <w:t xml:space="preserve">Pendiente: medir el consumo real, valorar mantener el Wi-Fi inicializado entre despertares y el sueño profundo en el nodo magnético con latidos más largos.</w:t>
       </w:r>
     </w:p>
     <w:p>
@@ -15402,6 +16502,24 @@
           <w:szCs w:val="22"/>
         </w:rPr>
         <w:t xml:space="preserve">Aviso de "cámara sin conexión", rotación de logs de Docker y retardo de entrada: propuestos, no implementados.</w:t>
+      </w:r>
+    </w:p>
+    <w:p>
+      <w:pPr>
+        <w:pStyle w:val="ListParagraph"/>
+        <w:numPr>
+          <w:ilvl w:val="0"/>
+          <w:numId w:val="2"/>
+        </w:numPr>
+        <w:spacing w:after="60"/>
+      </w:pPr>
+      <w:r>
+        <w:rPr>
+          <w:rFonts w:ascii="Calibri" w:cs="Calibri" w:eastAsia="Calibri" w:hAnsi="Calibri"/>
+          <w:sz w:val="22"/>
+          <w:szCs w:val="22"/>
+        </w:rPr>
+        <w:t xml:space="preserve">Ahorro de batería del nodo C3 (sección 5.4): implementado en el firmware pero sin compilar ni medir en hardware; la duración de las pilas es una estimación teórica y el retardo de hasta 20 s en conocer el estado de armado debe validarse en pruebas.</w:t>
       </w:r>
     </w:p>
     <w:p>

</xml_diff>